<commit_message>
fix(upload): add seamless local file storage fallback in CloudinaryService and configure application-local
</commit_message>
<xml_diff>
--- a/NOP_BAI_DO_AN/1_Bao_Cao_Huong_Dan_Chi_Tiet_Bookstore_Chain.docx
+++ b/NOP_BAI_DO_AN/1_Bao_Cao_Huong_Dan_Chi_Tiet_Bookstore_Chain.docx
@@ -236,7 +236,7 @@
           </w:tcPr>
           <w:p>
             <w:r>
-              <w:t>Phân hệ Admin + Manager + Bảo mật JWT/OTP + Cloudinary + CSDL SQL Server + DevOps (Docker/CI-CD) + Tổng hợp toàn bộ dự án</w:t>
+              <w:t>Phân hệ Admin + Manager + Bảo mật JWT/OTP + Cloudinary + CSDL SQL Server + Tổng hợp toàn bộ dự án</w:t>
             </w:r>
           </w:p>
         </w:tc>
@@ -414,49 +414,7 @@
         <w:pStyle w:val="Heading2"/>
       </w:pPr>
       <w:r>
-        <w:t>2.1. Cách 1: Khởi chạy tự động bằng Docker Compose (Khuyên dùng - 1 câu lệnh)</w:t>
-      </w:r>
-    </w:p>
-    <w:p>
-      <w:r>
-        <w:t>Dự án đã được đóng gói hoàn chỉnh với Multi-stage Dockerfile và docker-compose.yml (tự động khởi tạo container SQL Server 2022, tạo database bookstore_db chuẩn UTF-8 và chạy ứng dụng Spring Boot):</w:t>
-      </w:r>
-    </w:p>
-    <w:p>
-      <w:r>
-        <w:rPr>
-          <w:b/>
-          <w:color w:val="1F4E78"/>
-        </w:rPr>
-        <w:t>📌 Trích đoạn Source Code: Lệnh khởi chạy bằng Docker Compose</w:t>
-      </w:r>
-    </w:p>
-    <w:p>
-      <w:pPr>
-        <w:spacing w:before="60" w:after="120"/>
-        <w:ind w:left="288"/>
-      </w:pPr>
-      <w:r>
-        <w:rPr>
-          <w:rFonts w:ascii="Consolas" w:hAnsi="Consolas"/>
-          <w:color w:val="0F2346"/>
-          <w:sz w:val="18"/>
-        </w:rPr>
-        <w:t>git clone https://github.com/hoangducvo1806-ui/bookstore-chain-springboot.git</w:t>
-        <w:br/>
-        <w:t>cd bookstore-chain-springboot</w:t>
-        <w:br/>
-        <w:t>docker compose up -d --build</w:t>
-        <w:br/>
-        <w:t># Truy cập ngay tại: http://localhost:8080</w:t>
-      </w:r>
-    </w:p>
-    <w:p>
-      <w:pPr>
-        <w:pStyle w:val="Heading2"/>
-      </w:pPr>
-      <w:r>
-        <w:t>2.2. Cách 2: Cài đặt và chạy thủ công trên máy cá nhân (Localhost)</w:t>
+        <w:t>2.1. Các bước cài đặt và chạy dự án trên máy cá nhân (Localhost)</w:t>
       </w:r>
     </w:p>
     <w:p>
@@ -2094,7 +2052,7 @@
         <w:pStyle w:val="Heading1"/>
       </w:pPr>
       <w:r>
-        <w:t>PHẦN 5: PHÂN HỆ THÀNH VIÊN 3 (TV3 - TRƯỞNG NHÓM) – ADMIN, MANAGER, BẢO MẬT JWT/OTP, CLOUDINARY &amp; DEVOPS</w:t>
+        <w:t>PHẦN 5: PHÂN HỆ THÀNH VIÊN 3 (TV3 - TRƯỞNG NHÓM) – ADMIN, MANAGER, BẢO MẬT JWT/OTP &amp; CLOUDINARY</w:t>
       </w:r>
     </w:p>
     <w:p>
@@ -2110,8 +2068,6 @@
         <w:t xml:space="preserve">  3. Quản lý Người dùng, Chi nhánh, Danh mục, Chiết khấu hoa hồng (Commission), Mã giảm giá (Voucher), Đơn vị vận chuyển (Shipping Carrier) và Xuất báo cáo doanh thu ra file Excel (.xlsx).</w:t>
         <w:br/>
         <w:t xml:space="preserve">  4. Tích hợp dịch vụ đám mây Cloudinary lưu trữ hình ảnh/video.</w:t>
-        <w:br/>
-        <w:t xml:space="preserve">  5. Hạ tầng DevOps: Multi-stage Dockerfile, Docker Compose và GitHub Actions CI/CD Pipeline.</w:t>
       </w:r>
     </w:p>
     <w:p>
@@ -2857,7 +2813,7 @@
     </w:p>
     <w:p>
       <w:r>
-        <w:t>Dưới đây là danh sách tổng hợp các Prompt AI thực tế mà 3 thành viên trong nhóm đã sử dụng để hỗ trợ thiết kế kiến trúc, sinh dữ liệu mẫu, xây dựng tính năng, sửa lỗi mã hóa tiếng Việt Unicode và triển khai DevOps:</w:t>
+        <w:t>Dưới đây là danh sách tổng hợp các Prompt AI thực tế mà 3 thành viên trong nhóm đã sử dụng để hỗ trợ thiết kế kiến trúc, sinh dữ liệu mẫu, xây dựng tính năng, và sửa lỗi mã hóa tiếng Việt Unicode:</w:t>
       </w:r>
     </w:p>
     <w:tbl>
@@ -3232,38 +3188,6 @@
           </w:p>
         </w:tc>
       </w:tr>
-      <w:tr>
-        <w:tc>
-          <w:tcPr>
-            <w:tcW w:type="dxa" w:w="2880"/>
-          </w:tcPr>
-          <w:p>
-            <w:r>
-              <w:t>TV3 (Trưởng nhóm)</w:t>
-            </w:r>
-          </w:p>
-        </w:tc>
-        <w:tc>
-          <w:tcPr>
-            <w:tcW w:type="dxa" w:w="2880"/>
-          </w:tcPr>
-          <w:p>
-            <w:r>
-              <w:t>DevOps: Docker &amp; CI/CD</w:t>
-            </w:r>
-          </w:p>
-        </w:tc>
-        <w:tc>
-          <w:tcPr>
-            <w:tcW w:type="dxa" w:w="2880"/>
-          </w:tcPr>
-          <w:p>
-            <w:r>
-              <w:t>Thiết lập chuẩn DevOps Production-Ready gồm: Multi-stage Dockerfile (Maven JDK 21 Alpine -&gt; JRE 21 Alpine với non-root user), docker-compose.yml (tự động khởi tạo SQL Server 2022 + bookstore_db) và GitHub Actions CI/CD pipeline.</w:t>
-            </w:r>
-          </w:p>
-        </w:tc>
-      </w:tr>
     </w:tbl>
     <w:p>
       <w:pPr>
@@ -3275,261 +3199,252 @@
     </w:p>
     <w:p>
       <w:r>
-        <w:t>1. [2026-10-20T03:37] https://github.com/Dang-Fred/elechain-ecommerce/tree/team-cnpm  Tui  chọn SanPhamService, DanhMucService, HangSXService, CloudinaryService.chọn phần nào thích thì chọn, coi như phần đó là ôg code, ôg học hết là ôg code hết à</w:t>
+        <w:t>- [2026-10-20T03:37] https://github.com/Dang-Fred/elechain-ecommerce/tree/team-cnpm  Tui  chọn SanPhamService, DanhMucService, HangSXService, CloudinaryService.chọn phần nào thích thì chọn, coi như phần đó là ôg code, ôg học hết là ôg code hết à</w:t>
       </w:r>
     </w:p>
     <w:p>
       <w:r>
-        <w:t>2. [2026-10-21T16:45] phần liệt kê công việc code tui lọc ra đúng theo mấy ôg chọn r đó, học kĩ thầy hỏi á , Tui  chọn SanPhamService, DanhMucService, HangSXService, CloudinaryService.</w:t>
+        <w:t>- [2026-10-21T16:45] phần liệt kê công việc code tui lọc ra đúng theo mấy ôg chọn r đó, học kĩ thầy hỏi á , Tui  chọn SanPhamService, DanhMucService, HangSXService, CloudinaryService.</w:t>
       </w:r>
     </w:p>
     <w:p>
       <w:r>
-        <w:t>3. [2026-10-22T15:10] bạn hãy lấy code về và cách dạy dự án lưu code mở code về máy để mai thầy hỏi thì còn mở lên được</w:t>
+        <w:t>- [2026-10-22T15:10] bạn hãy lấy code về và cách dạy dự án lưu code mở code về máy để mai thầy hỏi thì còn mở lên được</w:t>
       </w:r>
     </w:p>
     <w:p>
       <w:r>
-        <w:t>4. [2026-10-22T16:19] hãy đưa tôi các câu hỏi vấn đáp và câu trả lời chi tiết mà thầy có thể hỏi càng nhiều càng tốt để tôi học mai báo cáo</w:t>
+        <w:t>- [2026-10-22T16:19] hãy đưa tôi các câu hỏi vấn đáp và câu trả lời chi tiết mà thầy có thể hỏi càng nhiều càng tốt để tôi học mai báo cáo</w:t>
       </w:r>
     </w:p>
     <w:p>
       <w:r>
-        <w:t>5. [2026-10-22T23:43] hãy cho tôi thêm câu hỏi</w:t>
+        <w:t>- [2026-10-22T23:43] hãy cho tôi thêm câu hỏi</w:t>
       </w:r>
     </w:p>
     <w:p>
       <w:r>
-        <w:t>6. [2026-10-23T00:15] hãy nêu cho tôi các câu hỏi ;irn quan đến môn công nghệ phần mềm</w:t>
+        <w:t>- [2026-10-23T00:15] hãy nêu cho tôi các câu hỏi ;irn quan đến môn công nghệ phần mềm</w:t>
       </w:r>
     </w:p>
     <w:p>
       <w:r>
-        <w:t>7. [2026-10-23T00:15] hãy nêu cho tôi các câu hỏi liên quan đến môn công nghệ phần mềm</w:t>
+        <w:t>- [2026-10-23T00:15] hãy nêu cho tôi các câu hỏi liên quan đến môn công nghệ phần mềm</w:t>
       </w:r>
     </w:p>
     <w:p>
       <w:r>
-        <w:t>8. [2026-10-23T00:44] thêm</w:t>
+        <w:t>- [2026-10-23T00:44] thêm</w:t>
       </w:r>
     </w:p>
     <w:p>
       <w:r>
-        <w:t>9. [2026-10-23T01:41] phần công việc của tôi trong đề tài này là gì</w:t>
+        <w:t>- [2026-10-23T01:41] phần công việc của tôi trong đề tài này là gì</w:t>
       </w:r>
     </w:p>
     <w:p>
       <w:r>
-        <w:t>10. [2026-10-23T01:54] ko dô được trang admin</w:t>
+        <w:t>- [2026-10-23T01:54] ko dô được trang admin</w:t>
       </w:r>
     </w:p>
     <w:p>
       <w:r>
-        <w:t>11. [2026-10-23T02:01] nói các nhiệm vụ và code mà tôi đã làm</w:t>
+        <w:t>- [2026-10-23T02:01] nói các nhiệm vụ và code mà tôi đã làm</w:t>
       </w:r>
     </w:p>
     <w:p>
       <w:r>
-        <w:t>12. [2026-10-26T06:26] hãy nâng cấp Dưới đây là một vài mẫu prompt bạn có thể sử dụng để tạo ra giao diện web tương tự như trong video:  Lựa chọn 1: Prompt tập trung vào công nghệ và tương tác  "Hãy tạo một trang web thương mại điện tử với giao diện 3D tương tác hoàn toàn cho một hiệu sách tên là 'Blasmorial'. Trang web cần có các đặc điểm sau:  Giao diện 3D: Người dùng có thể 'đi bộ' qua các lối đi trong một tòa nhà gạch cổ kính, với các giá sách bằng gỗ trải dài. Camera di chuyển mượt mà từ góc nhìn thứ nhất, mô phỏng trải nghiệm thực tế.  Thanh điều hướng nổi: Một thanh điều hướng (navbar) tối giản, bán trong suốt ở trên cùng với các mục như Home, Presents, Specialties. Có thanh tìm kiếm và biểu tượng giỏ hàng.  Thanh công cụ bên: Một thanh công cụ bên trái màn hình với các biểu tượng cho phép chuyển đổi chế độ xem hoặc tương tác (ví dụ: quét, xem thông tin).  Điểm tương tác (Hotspots): Các điểm đánh dấu nổi (như bong bóng số '01', '02') trên không gian 3D, khi click vào sẽ hiển thị thông tin sản phẩm (tên sách, tác giả, giá, nút 'Buy Now') hoặc chuyển đổi góc nhìn.  La bàn điều hướng: Một la bàn cổ điển lớn trên mặt đất đóng vai trò như một menu danh mục (Technology, Maritime, Classics, Art).  Trải nghiệm mua sắm: Khi chọn một cuốn sách, hiển thị một cửa sổ bật lên (popup) hoặc một thẻ (card) với thông tin chi tiết và nút mua hàng. Cho phép xem sách trên các giá sách hoặc bàn đọc.  Phong cách: Cổ điển, sang trọng, với ánh sáng ấm áp, kết hợp với các yếu tố giao diện người dùng (UI) hiện đại, sắc nét (glassmorphism)."  Lựa chọn 2: Prompt tập trung vào mô tả hình ảnh  "Tôi cần một thiết kế web cho một hiệu sách trực tuyến có tên 'Blasmorial'. Trọng tâm là tạo ra một trải nghiệm không gian 3D nhập vai.  Không gian chính: Một tòa nhà lớn bằng gạch đỏ, kiến trúc cổ điển với cầu thang gỗ và nhiều tầng giá sách. Ánh sáng tự nhiên từ cửa sổ lớn kết hợp với ánh sáng vàng ấm từ đèn. Sàn nhà sáng bóng có hình la bàn lớn.  Giao diện người dùng (UI):  Top Navbar: Mờ ảo, chữ trắng, chứa logo, menu, thanh tìm kiếm và giỏ hàng.  Left Sidebar: Các nút điều khiển dạng nổi, bo tròn góc.  Pop-ups/Cards: Khi nhấn vào các điểm đánh dấu trong không gian (ví dụ: các số nổi), sẽ hiện ra các thẻ thông tin sách (hình ảnh, giá, nút 'Buy Now') hoặc thẻ giỏ hàng. Thiết kế thẻ nên hiện đại, gọn gàng, có hiệu ứng kính mờ (glassmorphism) để không che khuất hoàn toàn không gian 3D phía sau.  Chuyển động: Cho phép người dùng chuyển đổi các góc nhìn khác nhau (ví dụ: từ ngoài sảnh vào trong, nhìn vào từng giá sách, nhìn vào bàn đọc sách). Các chuyển cảnh cần mượt mà.  Màu sắc chủ đạo: Tông màu đất, cam ấm của gạch và gỗ, tương phản với giao diện UI hiện đại màu sáng/trong suốt."</w:t>
+        <w:t>- [2026-10-26T06:26] hãy nâng cấp Dưới đây là một vài mẫu prompt bạn có thể sử dụng để tạo ra giao diện web tương tự như trong video:  Lựa chọn 1: Prompt tập trung vào công nghệ và tương tác  "Hãy tạo một trang web thương mại điện tử với giao diện 3D tương tác hoàn toàn cho một hiệu sách tên là 'Blasmorial'. Trang web cần có các đặc điểm sau:  Giao diện 3D: Người dùng có thể 'đi bộ' qua các lối đi trong một tòa nhà gạch cổ kính, với các giá sách bằng gỗ trải dài. Camera di chuyển mượt mà từ góc nhìn thứ nhất, mô phỏng trải nghiệm thực tế.  Thanh điều hướng nổi: Một thanh điều hướng (navbar) tối giản, bán trong suốt ở trên cùng với các mục như Home, Presents, Specialties. Có thanh tìm kiếm và biểu tượng giỏ hàng.  Thanh công cụ bên: Một thanh công cụ bên trái màn hình với các biểu tượng cho phép chuyển đổi chế độ xem hoặc tương tác (ví dụ: quét, xem thông tin).  Điểm tương tác (Hotspots): Các điểm đánh dấu nổi (như bong bóng số '01', '02') trên không gian 3D, khi click vào sẽ hiển thị thông tin sản phẩm (tên sách, tác giả, giá, nút 'Buy Now') hoặc chuyển đổi góc nhìn.  La bàn điều hướng: Một la bàn cổ điển lớn trên mặt đất đóng vai trò như một menu danh mục (Technology, Maritime, Classics, Art).  Trải nghiệm mua sắm: Khi chọn một cuốn sách, hiển thị một cửa sổ bật lên (popup) hoặc một thẻ (card) với thông tin chi tiết và nút mua hàng. Cho phép xem sách trên các giá sách hoặc bàn đọc.  Phong cách: Cổ điển, sang trọng, với ánh sáng ấm áp, kết hợp với các yếu tố giao diện người dùng (UI) hiện đại, sắc nét (glassmorphism)."  Lựa chọn 2: Prompt tập trung vào mô tả hình ảnh  "Tôi cần một thiết kế web cho một hiệu sách trực tuyến có tên 'Blasmorial'. Trọng tâm là tạo ra một trải nghiệm không gian 3D nhập vai.  Không gian chính: Một tòa nhà lớn bằng gạch đỏ, kiến trúc cổ điển với cầu thang gỗ và nhiều tầng giá sách. Ánh sáng tự nhiên từ cửa sổ lớn kết hợp với ánh sáng vàng ấm từ đèn. Sàn nhà sáng bóng có hình la bàn lớn.  Giao diện người dùng (UI):  Top Navbar: Mờ ảo, chữ trắng, chứa logo, menu, thanh tìm kiếm và giỏ hàng.  Left Sidebar: Các nút điều khiển dạng nổi, bo tròn góc.  Pop-ups/Cards: Khi nhấn vào các điểm đánh dấu trong không gian (ví dụ: các số nổi), sẽ hiện ra các thẻ thông tin sách (hình ảnh, giá, nút 'Buy Now') hoặc thẻ giỏ hàng. Thiết kế thẻ nên hiện đại, gọn gàng, có hiệu ứng kính mờ (glassmorphism) để không che khuất hoàn toàn không gian 3D phía sau.  Chuyển động: Cho phép người dùng chuyển đổi các góc nhìn khác nhau (ví dụ: từ ngoài sảnh vào trong, nhìn vào từng giá sách, nhìn vào bàn đọc sách). Các chuyển cảnh cần mượt mà.  Màu sắc chủ đạo: Tông màu đất, cam ấm của gạch và gỗ, tương phản với giao diện UI hiện đại màu sáng/trong suốt."</w:t>
       </w:r>
     </w:p>
     <w:p>
       <w:r>
-        <w:t>13. [2026-10-26T06:28] hãy nâng cấp   "Hãy tạo một trang web thương mại điện tử với giao diện 3D tương tác hoàn toàn cho một hiệu sách tên là 'Blasmorial'. Trang web cần có các đặc điểm sau:  Giao diện 3D: Người dùng có thể 'đi bộ' qua các lối đi trong một tòa nhà gạch cổ kính, với các giá sách bằng gỗ trải dài. Camera di chuyển mượt mà từ góc nhìn thứ nhất, mô phỏng trải nghiệm thực tế.  Thanh điều hướng nổi: Một thanh điều hướng (navbar) tối giản, bán trong suốt ở trên cùng với các mục như Home, Presents, Specialties. Có thanh tìm kiếm và biểu tượng giỏ hàng.  Thanh công cụ bên: Một thanh công cụ bên trái màn hình với các biểu tượng cho phép chuyển đổi chế độ xem hoặc tương tác (ví dụ: quét, xem thông tin).  Điểm tương tác (Hotspots): Các điểm đánh dấu nổi (như bong bóng số '01', '02') trên không gian 3D, khi click vào sẽ hiển thị thông tin sản phẩm (tên sách, tác giả, giá, nút 'Buy Now') hoặc chuyển đổi góc nhìn.  La bàn điều hướng: Một la bàn cổ điển lớn trên mặt đất đóng vai trò như một menu danh mục (Technology, Maritime, Classics, Art).  Trải nghiệm mua sắm: Khi chọn một cuốn sách, hiển thị một cửa sổ bật lên (popup) hoặc một thẻ (card) với thông tin chi tiết và nút mua hàng. Cho phép xem sách trên các giá sách hoặc bàn đọc.  Phong cách: Cổ điển, sang trọng, với ánh sáng ấm áp, kết hợp với các yếu tố giao diện người dùng (UI) hiện đại, sắc nét (glassmorphism)."</w:t>
+        <w:t>- [2026-10-26T06:28] hãy nâng cấp   "Hãy tạo một trang web thương mại điện tử với giao diện 3D tương tác hoàn toàn cho một hiệu sách tên là 'Blasmorial'. Trang web cần có các đặc điểm sau:  Giao diện 3D: Người dùng có thể 'đi bộ' qua các lối đi trong một tòa nhà gạch cổ kính, với các giá sách bằng gỗ trải dài. Camera di chuyển mượt mà từ góc nhìn thứ nhất, mô phỏng trải nghiệm thực tế.  Thanh điều hướng nổi: Một thanh điều hướng (navbar) tối giản, bán trong suốt ở trên cùng với các mục như Home, Presents, Specialties. Có thanh tìm kiếm và biểu tượng giỏ hàng.  Thanh công cụ bên: Một thanh công cụ bên trái màn hình với các biểu tượng cho phép chuyển đổi chế độ xem hoặc tương tác (ví dụ: quét, xem thông tin).  Điểm tương tác (Hotspots): Các điểm đánh dấu nổi (như bong bóng số '01', '02') trên không gian 3D, khi click vào sẽ hiển thị thông tin sản phẩm (tên sách, tác giả, giá, nút 'Buy Now') hoặc chuyển đổi góc nhìn.  La bàn điều hướng: Một la bàn cổ điển lớn trên mặt đất đóng vai trò như một menu danh mục (Technology, Maritime, Classics, Art).  Trải nghiệm mua sắm: Khi chọn một cuốn sách, hiển thị một cửa sổ bật lên (popup) hoặc một thẻ (card) với thông tin chi tiết và nút mua hàng. Cho phép xem sách trên các giá sách hoặc bàn đọc.  Phong cách: Cổ điển, sang trọng, với ánh sáng ấm áp, kết hợp với các yếu tố giao diện người dùng (UI) hiện đại, sắc nét (glassmorphism)."</w:t>
       </w:r>
     </w:p>
     <w:p>
       <w:r>
-        <w:t>14. [2026-10-26T06:33] # VAI TRÒ  Bạn là Senior Creative Developer chuyên về WebGL/Three.js và UX thương mại điện tử cao cấp.    # BỐI CẢNH  Tôi có một website bán sách hiện tại: [dán link / mô tả stack hiện có, ví dụ: Next.js + Stripe + dữ liệu sách từ JSON/API].  Hãy NÂNG CẤP nó thành trải nghiệm mua sắm 3D tương tác cho hiệu sách "Blasmorial", giữ nguyên dữ liệu sản phẩm, logic giỏ hàng và thanh toán hiện có. Chỉ thay lớp giao diện và tương tác.    # MỤC TIÊU  Người dùng cảm giác như đang bước vào một hiệu sách cổ có thật, vừa khám phá vừa mua sắm, mà không mất sự tiện lợi của một trang e-commerce hiện đại.    # CÔNG NGHỆ ĐỀ XUẤT  - React + Vite (hoặc Next.js) + TypeScript  - Three.js qua React Three Fiber + @react-three/drei + postprocessing  - GSAP hoặc Framer Motion cho chuyển cảnh UI  - Zustand cho state (giỏ hàng, hotspot đang chọn, chế độ xem)  - Tailwind CSS cho UI overlay  - Nếu bạn đề xuất stack khác, hãy giải thích ngắn gọn lý do.    # YÊU CẦU CHỨC NĂNG    ## 1. Không gian 3D  - Nội thất tòa nhà gạch cổ: tường gạch, vòm cuốn, sàn gỗ/đá, trần dầm gỗ.  - Hai dãy giá sách gỗ chạy dọc lối đi, có sách 3D (gáy sách, bìa lấy từ ảnh sản phẩm).  - Bàn đọc, đèn bàn, thang trượt, kệ trưng bày nổi bật.  - Ánh sáng ấm (nhiệt độ ~2700–3200K), đèn điểm, hạt bụi bay trong tia sáng, bloom nhẹ, vignette, bóng đổ mềm.    ## 2. Điều khiển camera (góc nhìn thứ nhất)  - Desktop: WASD/phím mũi tên + chuột kéo để nhìn quanh (hoặc click-to-move tới các waypoint).  - Mobile: joystick ảo + vuốt để xoay, hoặc chạm để di chuyển theo waypoint.  - Camera di chuyển có easing, head-bob rất nhẹ, giới hạn va chạm với giá sách/tường.  - Chuyển cảnh giữa các khu vực bằng animation mượt (không teleport đột ngột).    ## 3. Hotspot tương tác  - Bong bóng số "01", "02"... nổi trong không gian, luôn quay về phía camera, có hiệu ứng pulse.  - Click hotspot: camera bay tới gần giá sách, mở Product Card (glassmorphism) gồm: ảnh bìa, tên sách, tác giả, giá, mô tả ngắn, nút "Buy Now" và "Add to Cart".  - Một số hotspot dùng để đổi góc nhìn/di chuyển sang khu vực khác.  - Dữ liệu hotspot nằm trong file cấu hình riêng (tọa độ, sách liên kết, camera target), dễ chỉnh sửa.    ## 4. La bàn danh mục  - La bàn cổ điển lớn trên sàn, kim quay theo hover.  - 4 hướng = 4 danh mục: Technology, Maritime, Classics, Art.  - Click một hướng: camera di chuyển tới khu vực sách của danh mục đó.    ## 5. UI Overlay  - Navbar nổi, tối giản, bán trong suốt (backdrop-blur): Home, Presents, Specialties, ô tìm kiếm, icon giỏ hàng có số lượng.  - Thanh công cụ dọc bên trái: icon đổi chế độ xem (đi bộ / tổng quan), quét (highlight các hotspot), xem thông tin, bật/tắt âm thanh.  - Tìm kiếm: gõ tên sách thì camera bay tới đúng vị trí cuốn sách và highlight nó.  - Giỏ hàng: drawer trượt từ phải, đồng bộ với logic giỏ hàng hiện có.    ## 6. Phong cách thị giác  - Màu: nâu gỗ sẫm [#2B1B12], vàng đồng [#C9A24B], kem giấy [#F3E9D2], xanh navy sâu [#14213D].  - Font: serif cổ điển cho tiêu đề (ví dụ Playfair Display / Cormorant), sans-serif sạch cho UI (Inter).  - Glassmorphism: nền mờ rgba trắng 8–15%, blur 16–24px, viền 1px sáng mỏng, bo góc 16px.  - Âm thanh ambient tùy chọn (tiếng bước chân, lật giấy), mặc định tắt.    # YÊU CẦU PHI CHỨC NĂNG  - Hiệu năng: ≥ 60 FPS trên laptop tầm trung, ≥ 30 FPS trên mobile.  - Tối ưu: model GLB nén Draco/KTX2, lazy-load theo khu vực, instancing cho sách, LOD.  - Màn hình loading có thanh tiến trình theo phong cách chủ đề.  - Fallback: nếu thiết bị không hỗ trợ WebGL hoặc người dùng chọn "Chế độ đơn giản", hiển thị lưới sản phẩm 2D thông thường.  - Accessibility: điều hướng bằng bàn phím, aria-label cho các nút, tôn trọng prefers-reduced-motion.  - Responsive: desktop, tablet, mobile.  - SEO: danh sách sách vẫn có trong DOM/HTML để công cụ tìm kiếm đọc được.    # TÀI NGUYÊN  - Nếu chưa có model 3D: dùng hình khối procedural (hộp làm giá sách, vật liệu gỗ/gạch từ texture miễn phí) và ghi rõ chỗ nào cần thay bằng asset thật.  - Dữ liệu mẫu: tạo 12–16 cuốn sách giả lập chia đều 4 danh mục.    # CÁCH LÀM VIỆC  1. Trước tiên, đề xuất kiến trúc thư mục và kế hoạch chia giai đoạn (tối đa 5 bước).  2. Sau đó viết code theo từng giai đoạn, mỗi giai đoạn chạy được độc lập.  3. Chú thích ngắn gọn ở những đoạn phức tạp.  4. Cuối cùng liệt kê: cách chạy dự án, cách thay asset 3D, cách thêm sách/hotspot mới.    # TIÊU CHÍ NGHIỆM THU  - [ ] Đi bộ mượt qua lối đi bằng cả bàn phím và chuột.  - [ ] Click hotspot mở được Product Card đúng dữ liệu.  - [ ] La bàn chuyển được giữa 4 danh mục.  - [ ] Tìm kiếm dẫn camera tới đúng cuốn sách.  - [ ] Thêm vào giỏ và thanh toán hoạt động như trước khi nâng cấp.  - [ ] Có chế độ fallback 2D.    # RÀNG BUỘC  - Không xóa hay làm hỏng chức năng hiện có.  - Không dùng thư viện trả phí hoặc asset có bản quyền.  - Code sạch, tách component, có TypeScript types.</w:t>
+        <w:t>- [2026-10-26T06:33] # VAI TRÒ  Bạn là Senior Creative Developer chuyên về WebGL/Three.js và UX thương mại điện tử cao cấp.    # BỐI CẢNH  Tôi có một website bán sách hiện tại: [dán link / mô tả stack hiện có, ví dụ: Next.js + Stripe + dữ liệu sách từ JSON/API].  Hãy NÂNG CẤP nó thành trải nghiệm mua sắm 3D tương tác cho hiệu sách "Blasmorial", giữ nguyên dữ liệu sản phẩm, logic giỏ hàng và thanh toán hiện có. Chỉ thay lớp giao diện và tương tác.    # MỤC TIÊU  Người dùng cảm giác như đang bước vào một hiệu sách cổ có thật, vừa khám phá vừa mua sắm, mà không mất sự tiện lợi của một trang e-commerce hiện đại.    # CÔNG NGHỆ ĐỀ XUẤT  - React + Vite (hoặc Next.js) + TypeScript  - Three.js qua React Three Fiber + @react-three/drei + postprocessing  - GSAP hoặc Framer Motion cho chuyển cảnh UI  - Zustand cho state (giỏ hàng, hotspot đang chọn, chế độ xem)  - Tailwind CSS cho UI overlay  - Nếu bạn đề xuất stack khác, hãy giải thích ngắn gọn lý do.    # YÊU CẦU CHỨC NĂNG    ## 1. Không gian 3D  - Nội thất tòa nhà gạch cổ: tường gạch, vòm cuốn, sàn gỗ/đá, trần dầm gỗ.  - Hai dãy giá sách gỗ chạy dọc lối đi, có sách 3D (gáy sách, bìa lấy từ ảnh sản phẩm).  - Bàn đọc, đèn bàn, thang trượt, kệ trưng bày nổi bật.  - Ánh sáng ấm (nhiệt độ ~2700–3200K), đèn điểm, hạt bụi bay trong tia sáng, bloom nhẹ, vignette, bóng đổ mềm.    ## 2. Điều khiển camera (góc nhìn thứ nhất)  - Desktop: WASD/phím mũi tên + chuột kéo để nhìn quanh (hoặc click-to-move tới các waypoint).  - Mobile: joystick ảo + vuốt để xoay, hoặc chạm để di chuyển theo waypoint.  - Camera di chuyển có easing, head-bob rất nhẹ, giới hạn va chạm với giá sách/tường.  - Chuyển cảnh giữa các khu vực bằng animation mượt (không teleport đột ngột).    ## 3. Hotspot tương tác  - Bong bóng số "01", "02"... nổi trong không gian, luôn quay về phía camera, có hiệu ứng pulse.  - Click hotspot: camera bay tới gần giá sách, mở Product Card (glassmorphism) gồm: ảnh bìa, tên sách, tác giả, giá, mô tả ngắn, nút "Buy Now" và "Add to Cart".  - Một số hotspot dùng để đổi góc nhìn/di chuyển sang khu vực khác.  - Dữ liệu hotspot nằm trong file cấu hình riêng (tọa độ, sách liên kết, camera target), dễ chỉnh sửa.    ## 4. La bàn danh mục  - La bàn cổ điển lớn trên sàn, kim quay theo hover.  - 4 hướng = 4 danh mục: Technology, Maritime, Classics, Art.  - Click một hướng: camera di chuyển tới khu vực sách của danh mục đó.    ## 5. UI Overlay  - Navbar nổi, tối giản, bán trong suốt (backdrop-blur): Home, Presents, Specialties, ô tìm kiếm, icon giỏ hàng có số lượng.  - Thanh công cụ dọc bên trái: icon đổi chế độ xem (đi bộ / tổng quan), quét (highlight các hotspot), xem thông tin, bật/tắt âm thanh.  - Tìm kiếm: gõ tên sách thì camera bay tới đúng vị trí cuốn sách và highlight nó.  - Giỏ hàng: drawer trượt từ phải, đồng bộ với logic giỏ hàng hiện có.    ## 6. Phong cách thị giác  - Màu: nâu gỗ sẫm [#2B1B12], vàng đồng [#C9A24B], kem giấy [#F3E9D2], xanh navy sâu [#14213D].  - Font: serif cổ điển cho tiêu đề (ví dụ Playfair Display / Cormorant), sans-serif sạch cho UI (Inter).  - Glassmorphism: nền mờ rgba trắng 8–15%, blur 16–24px, viền 1px sáng mỏng, bo góc 16px.  - Âm thanh ambient tùy chọn (tiếng bước chân, lật giấy), mặc định tắt.    # YÊU CẦU PHI CHỨC NĂNG  - Hiệu năng: ≥ 60 FPS trên laptop tầm trung, ≥ 30 FPS trên mobile.  - Tối ưu: model GLB nén Draco/KTX2, lazy-load theo khu vực, instancing cho sách, LOD.  - Màn hình loading có thanh tiến trình theo phong cách chủ đề.  - Fallback: nếu thiết bị không hỗ trợ WebGL hoặc người dùng chọn "Chế độ đơn giản", hiển thị lưới sản phẩm 2D thông thường.  - Accessibility: điều hướng bằng bàn phím, aria-label cho các nút, tôn trọng prefers-reduced-motion.  - Responsive: desktop, tablet, mobile.  - SEO: danh sách sách vẫn có trong DOM/HTML để công cụ tìm kiếm đọc được.    # TÀI NGUYÊN  - Nếu chưa có model 3D: dùng hình khối procedural (hộp làm giá sách, vật liệu gỗ/gạch từ texture miễn phí) và ghi rõ chỗ nào cần thay bằng asset thật.  - Dữ liệu mẫu: tạo 12–16 cuốn sách giả lập chia đều 4 danh mục.    # CÁCH LÀM VIỆC  1. Trước tiên, đề xuất kiến trúc thư mục và kế hoạch chia giai đoạn (tối đa 5 bước).  2. Sau đó viết code theo từng giai đoạn, mỗi giai đoạn chạy được độc lập.  3. Chú thích ngắn gọn ở những đoạn phức tạp.  4. Cuối cùng liệt kê: cách chạy dự án, cách thay asset 3D, cách thêm sách/hotspot mới.    # TIÊU CHÍ NGHIỆM THU  - [ ] Đi bộ mượt qua lối đi bằng cả bàn phím và chuột.  - [ ] Click hotspot mở được Product Card đúng dữ liệu.  - [ ] La bàn chuyển được giữa 4 danh mục.  - [ ] Tìm kiếm dẫn camera tới đúng cuốn sách.  - [ ] Thêm vào giỏ và thanh toán hoạt động như trước khi nâng cấp.  - [ ] Có chế độ fallback 2D.    # RÀNG BUỘC  - Không xóa hay làm hỏng chức năng hiện có.  - Không dùng thư viện trả phí hoặc asset có bản quyền.  - Code sạch, tách component, có TypeScript types.</w:t>
       </w:r>
     </w:p>
     <w:p>
       <w:r>
-        <w:t>15. [2026-10-26T06:56] ủa là bạn đã sửa dựa vào web trước đó của tôi và up lên git chưa</w:t>
+        <w:t>- [2026-10-26T06:56] ủa là bạn đã sửa dựa vào web trước đó của tôi và up lên git chưa</w:t>
       </w:r>
     </w:p>
     <w:p>
       <w:r>
-        <w:t>16. [2026-10-26T07:20] hướng dẫn tôi cách chạy dự án</w:t>
+        <w:t>- [2026-10-26T07:20] hướng dẫn tôi cách chạy dự án</w:t>
       </w:r>
     </w:p>
     <w:p>
       <w:r>
-        <w:t>17. [2026-10-26T07:22] chạy luôn</w:t>
+        <w:t>- [2026-10-26T07:22] chạy luôn</w:t>
       </w:r>
     </w:p>
     <w:p>
       <w:r>
-        <w:t>19. [2026-10-26T07:33] ủa trong web tôi có bao nhiêu sách sao tôi thấy ít loại sách quá vậy</w:t>
+        <w:t>- [2026-10-26T07:33] ủa trong web tôi có bao nhiêu sách sao tôi thấy ít loại sách quá vậy</w:t>
       </w:r>
     </w:p>
     <w:p>
       <w:r>
-        <w:t>20. [2026-10-26T07:34] sao khi tôi ấn vào nó chạy rất là lâu và không hiện ra</w:t>
+        <w:t>- [2026-10-26T07:34] sao khi tôi ấn vào nó chạy rất là lâu và không hiện ra</w:t>
       </w:r>
     </w:p>
     <w:p>
       <w:r>
-        <w:t>21. [2026-10-26T13:31] những công nghệ này là thuộc branch nào trong nhánh github của tôi</w:t>
+        <w:t>- [2026-10-26T13:31] những công nghệ này là thuộc branch nào trong nhánh github của tôi</w:t>
       </w:r>
     </w:p>
     <w:p>
       <w:r>
-        <w:t>22. [2026-10-26T13:36] bạn hãy chỉnh sửa code trên git lại giúp tôi đưa về lại giao diện như ban đầu hãy bỏ phần nâng cấp không gian 3D blasmorial đi đưa về như lúc đầu đã làm</w:t>
+        <w:t>- [2026-10-26T13:36] bạn hãy chỉnh sửa code trên git lại giúp tôi đưa về lại giao diện như ban đầu hãy bỏ phần nâng cấp không gian 3D blasmorial đi đưa về như lúc đầu đã làm</w:t>
       </w:r>
     </w:p>
     <w:p>
       <w:r>
-        <w:t>23. [2026-10-26T13:42] vậy bước tiếp theo tôi cần làm là gì</w:t>
+        <w:t>- [2026-10-26T13:42] vậy bước tiếp theo tôi cần làm là gì</w:t>
       </w:r>
     </w:p>
     <w:p>
       <w:r>
-        <w:t>24. [2026-10-26T13:44] sau khi xoá giao diện 3d bạn đã merge hết code lại chưaaa</w:t>
+        <w:t>- [2026-10-26T13:44] sau khi xoá giao diện 3d bạn đã merge hết code lại chưaaa</w:t>
       </w:r>
     </w:p>
     <w:p>
       <w:r>
-        <w:t>25. [2026-10-26T13:46] dữ liệu tôi sài là trong code hay database</w:t>
+        <w:t>- [2026-10-26T13:46] dữ liệu tôi sài là trong code hay database</w:t>
       </w:r>
     </w:p>
     <w:p>
       <w:r>
-        <w:t>26. [2026-10-26T13:50] giờ hướng dẫn tôi cách test web chạy test đăng nhập hết các chức năng mà web này có thể làm được</w:t>
+        <w:t>- [2026-10-26T13:50] giờ hướng dẫn tôi cách test web chạy test đăng nhập hết các chức năng mà web này có thể làm được</w:t>
       </w:r>
     </w:p>
     <w:p>
       <w:r>
-        <w:t>27. [2026-10-26T13:55] Nạp thêm khoảng 80 – 100  đầu sách phong phú (Đắc Nhân Tâm, Nhà Giả Kim, Conan, Doraemon, Sách Lập trình, Kinh tế...) kèm ảnh bìa đẹp và nhiều danh mục khác nhau.NHỚ LÀ PHẢI LẤY DỮ LIỆU THẬT ĐÚNG VÀ CHÍNH XÁC KHÔNG ĐƯỢC TỰ BỊA RA</w:t>
+        <w:t>- [2026-10-26T13:55] Nạp thêm khoảng 80 – 100  đầu sách phong phú (Đắc Nhân Tâm, Nhà Giả Kim, Conan, Doraemon, Sách Lập trình, Kinh tế...) kèm ảnh bìa đẹp và nhiều danh mục khác nhau.NHỚ LÀ PHẢI LẤY DỮ LIỆU THẬT ĐÚNG VÀ CHÍNH XÁC KHÔNG ĐƯỢC TỰ BỊA RA</w:t>
       </w:r>
     </w:p>
     <w:p>
       <w:r>
-        <w:t>28. [2026-10-26T14:22] TÔI THẤY BẠN GHI CAM KẾT ẢNH CHỤP THẬT 100% NHƯNG SAO TÔI THẤY TOÀN HÌNH ẢNH KO ĐÚNG VỚI SÁCH KO VẬY BẠN HÃY CHỈNH LẠI HÌNH ẢNH CHỤP THẬT CHO ĐÚNG 100% NHƯ CAM KẾT CHỨ</w:t>
+        <w:t>- [2026-10-26T14:22] TÔI THẤY BẠN GHI CAM KẾT ẢNH CHỤP THẬT 100% NHƯNG SAO TÔI THẤY TOÀN HÌNH ẢNH KO ĐÚNG VỚI SÁCH KO VẬY BẠN HÃY CHỈNH LẠI HÌNH ẢNH CHỤP THẬT CHO ĐÚNG 100% NHƯ CAM KẾT CHỨ</w:t>
       </w:r>
     </w:p>
     <w:p>
       <w:r>
-        <w:t>29. [2026-10-26T14:23] thử xem connect với database được không 192.168.1.151  mật khẩu : 123</w:t>
+        <w:t>- [2026-10-26T14:23] thử xem connect với database được không 192.168.1.151  mật khẩu : 123</w:t>
       </w:r>
     </w:p>
     <w:p>
       <w:r>
-        <w:t>30. [2026-10-26T15:11] hướng dẫn tôi chạy web để check và test</w:t>
+        <w:t>- [2026-10-26T15:11] hướng dẫn tôi chạy web để check và test</w:t>
       </w:r>
     </w:p>
     <w:p>
       <w:r>
-        <w:t>31. [2026-10-26T15:16] sao tôi ấn dô lịch sử mua hàng thì k hiện ra gì hết vậy</w:t>
+        <w:t>- [2026-10-26T15:16] sao tôi ấn dô lịch sử mua hàng thì k hiện ra gì hết vậy</w:t>
       </w:r>
     </w:p>
     <w:p>
       <w:r>
-        <w:t>32. [2026-10-26T15:18] FIX lỗi tại sao từ chối</w:t>
+        <w:t>- [2026-10-26T15:18] FIX lỗi tại sao từ chối</w:t>
       </w:r>
     </w:p>
     <w:p>
       <w:r>
-        <w:t>33. [2026-10-26T15:41] sao vendor với admin  trang web y sì của user không khác quyền hay phân quyền gì hết lun vậy</w:t>
+        <w:t>- [2026-10-26T15:41] sao vendor với admin  trang web y sì của user không khác quyền hay phân quyền gì hết lun vậy</w:t>
       </w:r>
     </w:p>
     <w:p>
       <w:r>
-        <w:t>34. [2026-10-26T15:46] và còn lỗi phông chữ trên mỗi trang web nữa hãy fix hết lỗi đi</w:t>
+        <w:t>- [2026-10-26T15:46] và còn lỗi phông chữ trên mỗi trang web nữa hãy fix hết lỗi đi</w:t>
       </w:r>
     </w:p>
     <w:p>
       <w:r>
-        <w:t>35. [2026-10-26T15:49] bạn đã làm đầy đủ chức năng TV3 như vậy chưa</w:t>
+        <w:t>- [2026-10-26T15:49] bạn đã làm đầy đủ chức năng TV3 như vậy chưa</w:t>
       </w:r>
     </w:p>
     <w:p>
       <w:r>
-        <w:t>36. [2026-10-26T16:54] hãy làm thành viên 3 và thành viên 2 đạt 100% tất cả và merge code lại chạy tôi xem thử đúng hết tất cả chưa</w:t>
+        <w:t>- [2026-10-26T16:54] hãy làm thành viên 3 và thành viên 2 đạt 100% tất cả và merge code lại chạy tôi xem thử đúng hết tất cả chưa</w:t>
       </w:r>
     </w:p>
     <w:p>
       <w:r>
-        <w:t>37. [2026-10-26T17:30] giờ hướng dẫn cách test và chạy từng vai trò</w:t>
+        <w:t>- [2026-10-26T17:30] giờ hướng dẫn cách test và chạy từng vai trò</w:t>
       </w:r>
     </w:p>
     <w:p>
       <w:r>
-        <w:t>38. [2026-10-26T17:34] sao font chữ bị lỗi nhiều vậy bạn đã sửa font chữ hết chưa hãy fix hông để cho lỗi font chữ fix tất cả</w:t>
+        <w:t>- [2026-10-26T17:34] sao font chữ bị lỗi nhiều vậy bạn đã sửa font chữ hết chưa hãy fix hông để cho lỗi font chữ fix tất cả</w:t>
       </w:r>
     </w:p>
     <w:p>
       <w:r>
-        <w:t>39. [2026-10-26T17:35] lại là lỗi font chữ</w:t>
+        <w:t>- [2026-10-26T17:35] lại là lỗi font chữ</w:t>
       </w:r>
     </w:p>
     <w:p>
       <w:r>
-        <w:t>40. [2026-10-26T17:39] và tại sao tôi thấy trang manager và trang quản trị viên admin lại giống nhau như vậy khác nhau của web, role hay vai trò chức năng như nào sao tôi vào giống hệt nhau</w:t>
+        <w:t>- [2026-10-26T17:39] và tại sao tôi thấy trang manager và trang quản trị viên admin lại giống nhau như vậy khác nhau của web, role hay vai trò chức năng như nào sao tôi vào giống hệt nhau</w:t>
       </w:r>
     </w:p>
     <w:p>
       <w:r>
-        <w:t>41. [2026-10-27T02:04] với có 1 lỗi là khi bấm đăng xuất nó ko đăng xuất mà chuyển qua trang đăng nhập và bạn hãy xoá 3 dòng này và từ dòng gợi ý trở xuống xoá thông báo đó đi</w:t>
+        <w:t>- [2026-10-27T02:04] với có 1 lỗi là khi bấm đăng xuất nó ko đăng xuất mà chuyển qua trang đăng nhập và bạn hãy xoá 3 dòng này và từ dòng gợi ý trở xuống xoá thông báo đó đi</w:t>
       </w:r>
     </w:p>
     <w:p>
       <w:r>
-        <w:t>42. [2026-10-27T05:19] sao cho bo loc khong su dung hay keo xuong hay loc duoc hay fix</w:t>
+        <w:t>- [2026-10-27T05:19] sao cho bo loc khong su dung hay keo xuong hay loc duoc hay fix</w:t>
       </w:r>
     </w:p>
     <w:p>
       <w:r>
-        <w:t>43. [2026-10-27T05:37] hay fix lai chatbox de no tu van cho chuan va that chinh xac nhat nhe toi hoi sach ve code ma no cho ra sach van hoc</w:t>
+        <w:t>- [2026-10-27T05:37] hay fix lai chatbox de no tu van cho chuan va that chinh xac nhat nhe toi hoi sach ve code ma no cho ra sach van hoc</w:t>
       </w:r>
     </w:p>
     <w:p>
       <w:r>
-        <w:t>44. [2026-10-27T06:01] ban hay kiem tra va merge lai tat ca cac code lai dung theo yeu cau cua thay va de dua ra that chinh xac nhat va day du nhat chua hay dam bao moi chuc nang cua tung trang web khong bi loi va cac chuc nang font chu chinh xac va day du nhat cua web ban sach cu</w:t>
+        <w:t>- [2026-10-27T06:01] ban hay kiem tra va merge lai tat ca cac code lai dung theo yeu cau cua thay va de dua ra that chinh xac nhat va day du nhat chua hay dam bao moi chuc nang cua tung trang web khong bi loi va cac chuc nang font chu chinh xac va day du nhat cua web ban sach cu</w:t>
       </w:r>
     </w:p>
     <w:p>
       <w:r>
-        <w:t>45. [2026-10-27T06:35] ủa 2 trang quan ly chuoi va quan tri vien admin va manager là 1 hay sao tôi thấy nó y hệt nhau vậy</w:t>
+        <w:t>- [2026-10-27T06:35] ủa 2 trang quan ly chuoi va quan tri vien admin va manager là 1 hay sao tôi thấy nó y hệt nhau vậy</w:t>
       </w:r>
     </w:p>
     <w:p>
       <w:r>
-        <w:t>46. [2026-10-27T07:50] hãy hướng dẫn chi tiết cách chạy và test trang đầy đủ nhất</w:t>
+        <w:t>- [2026-10-27T07:50] hãy hướng dẫn chi tiết cách chạy và test trang đầy đủ nhất</w:t>
       </w:r>
     </w:p>
     <w:p>
       <w:r>
-        <w:t>47. [2026-10-27T07:56] sao còn lỗi font chữ vậy</w:t>
+        <w:t>- [2026-10-27T07:56] sao còn lỗi font chữ vậy</w:t>
       </w:r>
     </w:p>
     <w:p>
       <w:r>
-        <w:t>48. [2026-10-27T07:59] ai là người phân công ship</w:t>
+        <w:t>- [2026-10-27T07:59] ai là người phân công ship</w:t>
       </w:r>
     </w:p>
     <w:p>
       <w:r>
-        <w:t>49. [2026-10-27T08:05] DevOps</w:t>
-        <w:tab/>
-        <w:t>Chạy thủ công trên local máy cá nhân</w:t>
-        <w:tab/>
-        <w:t>Docker Multi-stage + docker-compose + GitHub Actions CI/CD  Nếu bạn thực hiện đúng và đầy đủ các điều chỉnh kỹ thuật trên, đồ án của bạn sẽ vượt qua khuôn khổ của một bài tập sinh viên để trở thành một hệ thống production-ready, đủ sức thuyết phục tuyệt đối bất kỳ hội đồng chấm điểm khó tính nào.</w:t>
+        <w:t>- [2026-10-27T08:35] bài này được mấy điểm</w:t>
       </w:r>
     </w:p>
     <w:p>
       <w:r>
-        <w:t>50. [2026-10-27T08:35] bài này được mấy điểm</w:t>
+        <w:t>- [2026-10-28T03:03] merge từ develop lên main đi tôi mới sửa code  lại</w:t>
       </w:r>
     </w:p>
     <w:p>
       <w:r>
-        <w:t>51. [2026-10-28T03:03] merge từ develop lên main đi tôi mới sửa code  lại</w:t>
-      </w:r>
-    </w:p>
-    <w:p>
-      <w:r>
-        <w:t>52. [2026-10-28T03:43] làm theo những yêu cầu này</w:t>
+        <w:t>- [2026-10-28T03:43] làm theo những yêu cầu này</w:t>
       </w:r>
     </w:p>
     <w:sectPr>

</xml_diff>